<commit_message>
feat: actualizar plantillas de analytica
</commit_message>
<xml_diff>
--- a/pesaje/analytica/Report/PrintActaEntrega.docx
+++ b/pesaje/analytica/Report/PrintActaEntrega.docx
@@ -313,7 +313,7 @@
                 <w:sz w:val="16"/>
                 <w:szCs w:val="16"/>
               </w:rPr>
-              <w:t>MINERAL RELAVE</w:t>
+              <w:t>MINERAL</w:t>
             </w:r>
           </w:p>
         </w:tc>
@@ -4675,7 +4675,6 @@
             <w:pStyle w:val="Piedepgina"/>
             <w:jc w:val="center"/>
           </w:pPr>
-          <w:proofErr w:type="spellStart"/>
           <w:r>
             <w:rPr>
               <w:rFonts w:ascii="Calibri" w:hAnsi="Calibri" w:cs="Calibri"/>
@@ -4686,7 +4685,6 @@
             </w:rPr>
             <w:t>V°B°</w:t>
           </w:r>
-          <w:proofErr w:type="spellEnd"/>
         </w:p>
       </w:tc>
       <w:tc>
@@ -4755,7 +4753,6 @@
             <w:pStyle w:val="Piedepgina"/>
             <w:jc w:val="center"/>
           </w:pPr>
-          <w:proofErr w:type="spellStart"/>
           <w:r>
             <w:rPr>
               <w:rFonts w:ascii="Calibri" w:hAnsi="Calibri" w:cs="Calibri"/>
@@ -4766,7 +4763,6 @@
             </w:rPr>
             <w:t>V°B°</w:t>
           </w:r>
-          <w:proofErr w:type="spellEnd"/>
         </w:p>
       </w:tc>
       <w:tc>
@@ -5644,7 +5640,6 @@
             <w:pStyle w:val="Piedepgina"/>
             <w:jc w:val="center"/>
           </w:pPr>
-          <w:proofErr w:type="spellStart"/>
           <w:r>
             <w:rPr>
               <w:rFonts w:ascii="Calibri" w:hAnsi="Calibri" w:cs="Calibri"/>
@@ -5655,7 +5650,6 @@
             </w:rPr>
             <w:t>V°B°</w:t>
           </w:r>
-          <w:proofErr w:type="spellEnd"/>
         </w:p>
       </w:tc>
       <w:tc>

</xml_diff>